<commit_message>
update link github repo and change file 02_onlineretail
</commit_message>
<xml_diff>
--- a/Overview/Session03_BaoCao_Template.docx
+++ b/Overview/Session03_BaoCao_Template.docx
@@ -1,6 +1,6 @@
 
 <file path=word/document.xml><?xml version="1.0" encoding="utf-8"?>
-<w:document xmlns:wpc="http://schemas.microsoft.com/office/word/2010/wordprocessingCanvas" xmlns:cx="http://schemas.microsoft.com/office/drawing/2014/chartex" xmlns:cx1="http://schemas.microsoft.com/office/drawing/2015/9/8/chartex" xmlns:cx2="http://schemas.microsoft.com/office/drawing/2015/10/21/chartex" xmlns:cx3="http://schemas.microsoft.com/office/drawing/2016/5/9/chartex" xmlns:cx4="http://schemas.microsoft.com/office/drawing/2016/5/10/chartex" xmlns:cx5="http://schemas.microsoft.com/office/drawing/2016/5/11/chartex" xmlns:cx6="http://schemas.microsoft.com/office/drawing/2016/5/12/chartex" xmlns:cx7="http://schemas.microsoft.com/office/drawing/2016/5/13/chartex" xmlns:cx8="http://schemas.microsoft.com/office/drawing/2016/5/14/chartex" xmlns:mc="http://schemas.openxmlformats.org/markup-compatibility/2006" xmlns:aink="http://schemas.microsoft.com/office/drawing/2016/ink" xmlns:am3d="http://schemas.microsoft.com/office/drawing/2017/model3d" xmlns:o="urn:schemas-microsoft-com:office:office" xmlns:oel="http://schemas.microsoft.com/office/2019/extlst" xmlns:r="http://schemas.openxmlformats.org/officeDocument/2006/relationships" xmlns:m="http://schemas.openxmlformats.org/officeDocument/2006/math" xmlns:v="urn:schemas-microsoft-com:vml" xmlns:wp14="http://schemas.microsoft.com/office/word/2010/wordprocessingDrawing" xmlns:wp="http://schemas.openxmlformats.org/drawingml/2006/wordprocessingDrawing" xmlns:w10="urn:schemas-microsoft-com:office:word" xmlns:w="http://schemas.openxmlformats.org/wordprocessingml/2006/main" xmlns:w14="http://schemas.microsoft.com/office/word/2010/wordml" xmlns:w15="http://schemas.microsoft.com/office/word/2012/wordml" xmlns:w16cex="http://schemas.microsoft.com/office/word/2018/wordml/cex" xmlns:w16cid="http://schemas.microsoft.com/office/word/2016/wordml/cid" xmlns:w16="http://schemas.microsoft.com/office/word/2018/wordml" xmlns:w16sdtdh="http://schemas.microsoft.com/office/word/2020/wordml/sdtdatahash" xmlns:w16se="http://schemas.microsoft.com/office/word/2015/wordml/symex" xmlns:wpg="http://schemas.microsoft.com/office/word/2010/wordprocessingGroup" xmlns:wpi="http://schemas.microsoft.com/office/word/2010/wordprocessingInk" xmlns:wne="http://schemas.microsoft.com/office/word/2006/wordml" xmlns:wps="http://schemas.microsoft.com/office/word/2010/wordprocessingShape" mc:Ignorable="w14 w15 w16se w16cid w16 w16cex w16sdtdh wp14">
+<w:document xmlns:wpc="http://schemas.microsoft.com/office/word/2010/wordprocessingCanvas" xmlns:cx="http://schemas.microsoft.com/office/drawing/2014/chartex" xmlns:cx1="http://schemas.microsoft.com/office/drawing/2015/9/8/chartex" xmlns:cx2="http://schemas.microsoft.com/office/drawing/2015/10/21/chartex" xmlns:cx3="http://schemas.microsoft.com/office/drawing/2016/5/9/chartex" xmlns:cx4="http://schemas.microsoft.com/office/drawing/2016/5/10/chartex" xmlns:cx5="http://schemas.microsoft.com/office/drawing/2016/5/11/chartex" xmlns:cx6="http://schemas.microsoft.com/office/drawing/2016/5/12/chartex" xmlns:cx7="http://schemas.microsoft.com/office/drawing/2016/5/13/chartex" xmlns:cx8="http://schemas.microsoft.com/office/drawing/2016/5/14/chartex" xmlns:mc="http://schemas.openxmlformats.org/markup-compatibility/2006" xmlns:aink="http://schemas.microsoft.com/office/drawing/2016/ink" xmlns:am3d="http://schemas.microsoft.com/office/drawing/2017/model3d" xmlns:o="urn:schemas-microsoft-com:office:office" xmlns:oel="http://schemas.microsoft.com/office/2019/extlst" xmlns:r="http://schemas.openxmlformats.org/officeDocument/2006/relationships" xmlns:m="http://schemas.openxmlformats.org/officeDocument/2006/math" xmlns:v="urn:schemas-microsoft-com:vml" xmlns:wp14="http://schemas.microsoft.com/office/word/2010/wordprocessingDrawing" xmlns:wp="http://schemas.openxmlformats.org/drawingml/2006/wordprocessingDrawing" xmlns:w10="urn:schemas-microsoft-com:office:word" xmlns:w="http://schemas.openxmlformats.org/wordprocessingml/2006/main" xmlns:w14="http://schemas.microsoft.com/office/word/2010/wordml" xmlns:w15="http://schemas.microsoft.com/office/word/2012/wordml" xmlns:w16cei="http://schemas.microsoft.com/office/word/2026/wordml/cei" xmlns:w16cex="http://schemas.microsoft.com/office/word/2018/wordml/cex" xmlns:w16cid="http://schemas.microsoft.com/office/word/2016/wordml/cid" xmlns:w16="http://schemas.microsoft.com/office/word/2018/wordml" xmlns:w16du="http://schemas.microsoft.com/office/word/2023/wordml/word16du" xmlns:w16sdtdh="http://schemas.microsoft.com/office/word/2020/wordml/sdtdatahash" xmlns:w16sdtfl="http://schemas.microsoft.com/office/word/2024/wordml/sdtformatlock" xmlns:w16se="http://schemas.microsoft.com/office/word/2015/wordml/symex" xmlns:wpg="http://schemas.microsoft.com/office/word/2010/wordprocessingGroup" xmlns:wpi="http://schemas.microsoft.com/office/word/2010/wordprocessingInk" xmlns:wne="http://schemas.microsoft.com/office/word/2006/wordml" xmlns:wps="http://schemas.microsoft.com/office/word/2010/wordprocessingShape" mc:Ignorable="w14 w15 w16se w16cid w16 w16cex w16sdtdh w16sdtfl w16du wp14">
   <w:body>
     <w:p>
       <w:pPr>
@@ -80,12 +80,6 @@
         <w:gridCol w:w="6350"/>
       </w:tblGrid>
       <w:tr>
-        <w:tblPrEx>
-          <w:tblCellMar>
-            <w:top w:w="0" w:type="dxa"/>
-            <w:bottom w:w="0" w:type="dxa"/>
-          </w:tblCellMar>
-        </w:tblPrEx>
         <w:tc>
           <w:tcPr>
             <w:tcW w:w="3000" w:type="dxa"/>
@@ -140,6 +134,7 @@
               <w:spacing w:line="360" w:lineRule="auto"/>
               <w:rPr>
                 <w:color w:val="000000" w:themeColor="text1"/>
+                <w:lang w:val="en-US"/>
               </w:rPr>
             </w:pPr>
             <w:r>
@@ -147,19 +142,22 @@
                 <w:color w:val="000000" w:themeColor="text1"/>
                 <w:sz w:val="22"/>
                 <w:szCs w:val="22"/>
-              </w:rPr>
-              <w:t>……………………………………………</w:t>
+                <w:lang w:val="en-US"/>
+              </w:rPr>
+              <w:t>Trần Duy Khánh</w:t>
+            </w:r>
+            <w:r>
+              <w:rPr>
+                <w:color w:val="000000" w:themeColor="text1"/>
+                <w:sz w:val="22"/>
+                <w:szCs w:val="22"/>
+              </w:rPr>
+              <w:t>………………………………</w:t>
             </w:r>
           </w:p>
         </w:tc>
       </w:tr>
       <w:tr>
-        <w:tblPrEx>
-          <w:tblCellMar>
-            <w:top w:w="0" w:type="dxa"/>
-            <w:bottom w:w="0" w:type="dxa"/>
-          </w:tblCellMar>
-        </w:tblPrEx>
         <w:tc>
           <w:tcPr>
             <w:tcW w:w="3000" w:type="dxa"/>
@@ -214,6 +212,7 @@
               <w:spacing w:line="360" w:lineRule="auto"/>
               <w:rPr>
                 <w:color w:val="000000" w:themeColor="text1"/>
+                <w:lang w:val="en-US"/>
               </w:rPr>
             </w:pPr>
             <w:r>
@@ -221,19 +220,22 @@
                 <w:color w:val="000000" w:themeColor="text1"/>
                 <w:sz w:val="22"/>
                 <w:szCs w:val="22"/>
-              </w:rPr>
-              <w:t>……………………………………………</w:t>
+                <w:lang w:val="en-US"/>
+              </w:rPr>
+              <w:t>24645411</w:t>
+            </w:r>
+            <w:r>
+              <w:rPr>
+                <w:color w:val="000000" w:themeColor="text1"/>
+                <w:sz w:val="22"/>
+                <w:szCs w:val="22"/>
+              </w:rPr>
+              <w:t>……………………………………</w:t>
             </w:r>
           </w:p>
         </w:tc>
       </w:tr>
       <w:tr>
-        <w:tblPrEx>
-          <w:tblCellMar>
-            <w:top w:w="0" w:type="dxa"/>
-            <w:bottom w:w="0" w:type="dxa"/>
-          </w:tblCellMar>
-        </w:tblPrEx>
         <w:tc>
           <w:tcPr>
             <w:tcW w:w="3000" w:type="dxa"/>
@@ -288,6 +290,7 @@
               <w:spacing w:line="360" w:lineRule="auto"/>
               <w:rPr>
                 <w:color w:val="000000" w:themeColor="text1"/>
+                <w:lang w:val="en-US"/>
               </w:rPr>
             </w:pPr>
             <w:r>
@@ -295,19 +298,22 @@
                 <w:color w:val="000000" w:themeColor="text1"/>
                 <w:sz w:val="22"/>
                 <w:szCs w:val="22"/>
-              </w:rPr>
-              <w:t>……………………………………………</w:t>
+                <w:lang w:val="en-US"/>
+              </w:rPr>
+              <w:t>DHKTPM20A</w:t>
+            </w:r>
+            <w:r>
+              <w:rPr>
+                <w:color w:val="000000" w:themeColor="text1"/>
+                <w:sz w:val="22"/>
+                <w:szCs w:val="22"/>
+              </w:rPr>
+              <w:t>…………………………………</w:t>
             </w:r>
           </w:p>
         </w:tc>
       </w:tr>
       <w:tr>
-        <w:tblPrEx>
-          <w:tblCellMar>
-            <w:top w:w="0" w:type="dxa"/>
-            <w:bottom w:w="0" w:type="dxa"/>
-          </w:tblCellMar>
-        </w:tblPrEx>
         <w:tc>
           <w:tcPr>
             <w:tcW w:w="3000" w:type="dxa"/>
@@ -369,8 +375,17 @@
                 <w:color w:val="000000" w:themeColor="text1"/>
                 <w:sz w:val="22"/>
                 <w:szCs w:val="22"/>
-              </w:rPr>
-              <w:t>……………………………………………</w:t>
+                <w:lang w:val="en-US"/>
+              </w:rPr>
+              <w:t>khanhtranduy258</w:t>
+            </w:r>
+            <w:r>
+              <w:rPr>
+                <w:color w:val="000000" w:themeColor="text1"/>
+                <w:sz w:val="22"/>
+                <w:szCs w:val="22"/>
+              </w:rPr>
+              <w:t>………………………………</w:t>
             </w:r>
           </w:p>
         </w:tc>
@@ -450,17 +465,16 @@
           <w:lang w:val="vi-VN"/>
         </w:rPr>
       </w:pPr>
-      <w:hyperlink r:id="rId5" w:history="1">
-        <w:r>
-          <w:rPr>
-            <w:rStyle w:val="Hyperlink"/>
-            <w:color w:val="000000" w:themeColor="text1"/>
-            <w:sz w:val="22"/>
-            <w:szCs w:val="22"/>
-          </w:rPr>
-          <w:t>https://github.com/&lt;MSSV_HoTen_Cystone&gt;/&lt;ten-repo&gt;</w:t>
-        </w:r>
-      </w:hyperlink>
+      <w:r>
+        <w:rPr>
+          <w:rStyle w:val="Hyperlink"/>
+          <w:color w:val="000000" w:themeColor="text1"/>
+          <w:sz w:val="22"/>
+          <w:szCs w:val="22"/>
+          <w:lang w:val="vi-VN"/>
+        </w:rPr>
+        <w:t>https://github.com/khanhtranduy258/Data-analytics-/tree/main/Overview</w:t>
+      </w:r>
       <w:r>
         <w:rPr>
           <w:rStyle w:val="Hyperlink"/>
@@ -543,16 +557,127 @@
         <w:spacing w:before="200" w:after="200" w:line="360" w:lineRule="auto"/>
         <w:jc w:val="center"/>
         <w:rPr>
-          <w:color w:val="000000" w:themeColor="text1"/>
-        </w:rPr>
-      </w:pPr>
-      <w:r>
-        <w:rPr>
           <w:i/>
           <w:iCs/>
           <w:color w:val="000000" w:themeColor="text1"/>
-        </w:rPr>
-        <w:t xml:space="preserve">    [ Dán ảnh chụp full màn hình vào đây ]    </w:t>
+          <w:lang w:val="en-US"/>
+        </w:rPr>
+      </w:pPr>
+      <w:r>
+        <w:rPr>
+          <w:i/>
+          <w:iCs/>
+          <w:color w:val="000000" w:themeColor="text1"/>
+        </w:rPr>
+        <w:lastRenderedPageBreak/>
+        <w:t xml:space="preserve">    [ Dán ảnh </w:t>
+      </w:r>
+      <w:r>
+        <w:rPr>
+          <w:i/>
+          <w:iCs/>
+          <w:color w:val="000000" w:themeColor="text1"/>
+        </w:rPr>
+        <w:drawing>
+          <wp:inline distT="0" distB="0" distL="0" distR="0" wp14:anchorId="544328FF" wp14:editId="544A2E11">
+            <wp:extent cx="5943600" cy="3337560"/>
+            <wp:effectExtent l="0" t="0" r="0" b="0"/>
+            <wp:docPr id="1080076380" name="Picture 1"/>
+            <wp:cNvGraphicFramePr>
+              <a:graphicFrameLocks xmlns:a="http://schemas.openxmlformats.org/drawingml/2006/main" noChangeAspect="1"/>
+            </wp:cNvGraphicFramePr>
+            <a:graphic xmlns:a="http://schemas.openxmlformats.org/drawingml/2006/main">
+              <a:graphicData uri="http://schemas.openxmlformats.org/drawingml/2006/picture">
+                <pic:pic xmlns:pic="http://schemas.openxmlformats.org/drawingml/2006/picture">
+                  <pic:nvPicPr>
+                    <pic:cNvPr id="1080076380" name=""/>
+                    <pic:cNvPicPr/>
+                  </pic:nvPicPr>
+                  <pic:blipFill>
+                    <a:blip r:embed="rId5"/>
+                    <a:stretch>
+                      <a:fillRect/>
+                    </a:stretch>
+                  </pic:blipFill>
+                  <pic:spPr>
+                    <a:xfrm>
+                      <a:off x="0" y="0"/>
+                      <a:ext cx="5943600" cy="3337560"/>
+                    </a:xfrm>
+                    <a:prstGeom prst="rect">
+                      <a:avLst/>
+                    </a:prstGeom>
+                  </pic:spPr>
+                </pic:pic>
+              </a:graphicData>
+            </a:graphic>
+          </wp:inline>
+        </w:drawing>
+      </w:r>
+      <w:r>
+        <w:rPr>
+          <w:i/>
+          <w:iCs/>
+          <w:color w:val="000000" w:themeColor="text1"/>
+        </w:rPr>
+        <w:t xml:space="preserve">chụp full màn hình vào đây ]    </w:t>
+      </w:r>
+    </w:p>
+    <w:p>
+      <w:pPr>
+        <w:pBdr>
+          <w:top w:val="single" w:sz="6" w:space="0" w:color="999999"/>
+          <w:left w:val="single" w:sz="6" w:space="0" w:color="999999"/>
+          <w:bottom w:val="single" w:sz="6" w:space="0" w:color="999999"/>
+          <w:right w:val="single" w:sz="6" w:space="0" w:color="999999"/>
+        </w:pBdr>
+        <w:spacing w:before="200" w:after="200" w:line="360" w:lineRule="auto"/>
+        <w:jc w:val="center"/>
+        <w:rPr>
+          <w:color w:val="000000" w:themeColor="text1"/>
+          <w:lang w:val="en-US"/>
+        </w:rPr>
+      </w:pPr>
+      <w:r>
+        <w:rPr>
+          <w:color w:val="000000" w:themeColor="text1"/>
+          <w:lang w:val="en-US"/>
+        </w:rPr>
+        <w:drawing>
+          <wp:inline distT="0" distB="0" distL="0" distR="0" wp14:anchorId="3EECD0F4" wp14:editId="312C1148">
+            <wp:extent cx="5943600" cy="3343910"/>
+            <wp:effectExtent l="0" t="0" r="0" b="8890"/>
+            <wp:docPr id="2076095277" name="Picture 1"/>
+            <wp:cNvGraphicFramePr>
+              <a:graphicFrameLocks xmlns:a="http://schemas.openxmlformats.org/drawingml/2006/main" noChangeAspect="1"/>
+            </wp:cNvGraphicFramePr>
+            <a:graphic xmlns:a="http://schemas.openxmlformats.org/drawingml/2006/main">
+              <a:graphicData uri="http://schemas.openxmlformats.org/drawingml/2006/picture">
+                <pic:pic xmlns:pic="http://schemas.openxmlformats.org/drawingml/2006/picture">
+                  <pic:nvPicPr>
+                    <pic:cNvPr id="2076095277" name=""/>
+                    <pic:cNvPicPr/>
+                  </pic:nvPicPr>
+                  <pic:blipFill>
+                    <a:blip r:embed="rId6"/>
+                    <a:stretch>
+                      <a:fillRect/>
+                    </a:stretch>
+                  </pic:blipFill>
+                  <pic:spPr>
+                    <a:xfrm>
+                      <a:off x="0" y="0"/>
+                      <a:ext cx="5943600" cy="3343910"/>
+                    </a:xfrm>
+                    <a:prstGeom prst="rect">
+                      <a:avLst/>
+                    </a:prstGeom>
+                  </pic:spPr>
+                </pic:pic>
+              </a:graphicData>
+            </a:graphic>
+          </wp:inline>
+        </w:drawing>
       </w:r>
     </w:p>
     <w:sectPr>
@@ -566,7 +691,7 @@
 </file>
 
 <file path=word/numbering.xml><?xml version="1.0" encoding="utf-8"?>
-<w:numbering xmlns:wpc="http://schemas.microsoft.com/office/word/2010/wordprocessingCanvas" xmlns:cx="http://schemas.microsoft.com/office/drawing/2014/chartex" xmlns:cx1="http://schemas.microsoft.com/office/drawing/2015/9/8/chartex" xmlns:cx2="http://schemas.microsoft.com/office/drawing/2015/10/21/chartex" xmlns:cx3="http://schemas.microsoft.com/office/drawing/2016/5/9/chartex" xmlns:cx4="http://schemas.microsoft.com/office/drawing/2016/5/10/chartex" xmlns:cx5="http://schemas.microsoft.com/office/drawing/2016/5/11/chartex" xmlns:cx6="http://schemas.microsoft.com/office/drawing/2016/5/12/chartex" xmlns:cx7="http://schemas.microsoft.com/office/drawing/2016/5/13/chartex" xmlns:cx8="http://schemas.microsoft.com/office/drawing/2016/5/14/chartex" xmlns:mc="http://schemas.openxmlformats.org/markup-compatibility/2006" xmlns:aink="http://schemas.microsoft.com/office/drawing/2016/ink" xmlns:am3d="http://schemas.microsoft.com/office/drawing/2017/model3d" xmlns:o="urn:schemas-microsoft-com:office:office" xmlns:oel="http://schemas.microsoft.com/office/2019/extlst" xmlns:r="http://schemas.openxmlformats.org/officeDocument/2006/relationships" xmlns:m="http://schemas.openxmlformats.org/officeDocument/2006/math" xmlns:v="urn:schemas-microsoft-com:vml" xmlns:wp14="http://schemas.microsoft.com/office/word/2010/wordprocessingDrawing" xmlns:wp="http://schemas.openxmlformats.org/drawingml/2006/wordprocessingDrawing" xmlns:w10="urn:schemas-microsoft-com:office:word" xmlns:w="http://schemas.openxmlformats.org/wordprocessingml/2006/main" xmlns:w14="http://schemas.microsoft.com/office/word/2010/wordml" xmlns:w15="http://schemas.microsoft.com/office/word/2012/wordml" xmlns:w16cex="http://schemas.microsoft.com/office/word/2018/wordml/cex" xmlns:w16cid="http://schemas.microsoft.com/office/word/2016/wordml/cid" xmlns:w16="http://schemas.microsoft.com/office/word/2018/wordml" xmlns:w16sdtdh="http://schemas.microsoft.com/office/word/2020/wordml/sdtdatahash" xmlns:w16se="http://schemas.microsoft.com/office/word/2015/wordml/symex" xmlns:wpg="http://schemas.microsoft.com/office/word/2010/wordprocessingGroup" xmlns:wpi="http://schemas.microsoft.com/office/word/2010/wordprocessingInk" xmlns:wne="http://schemas.microsoft.com/office/word/2006/wordml" xmlns:wps="http://schemas.microsoft.com/office/word/2010/wordprocessingShape" mc:Ignorable="w14 w15 w16se w16cid w16 w16cex w16sdtdh wp14">
+<w:numbering xmlns:wpc="http://schemas.microsoft.com/office/word/2010/wordprocessingCanvas" xmlns:cx="http://schemas.microsoft.com/office/drawing/2014/chartex" xmlns:cx1="http://schemas.microsoft.com/office/drawing/2015/9/8/chartex" xmlns:cx2="http://schemas.microsoft.com/office/drawing/2015/10/21/chartex" xmlns:cx3="http://schemas.microsoft.com/office/drawing/2016/5/9/chartex" xmlns:cx4="http://schemas.microsoft.com/office/drawing/2016/5/10/chartex" xmlns:cx5="http://schemas.microsoft.com/office/drawing/2016/5/11/chartex" xmlns:cx6="http://schemas.microsoft.com/office/drawing/2016/5/12/chartex" xmlns:cx7="http://schemas.microsoft.com/office/drawing/2016/5/13/chartex" xmlns:cx8="http://schemas.microsoft.com/office/drawing/2016/5/14/chartex" xmlns:mc="http://schemas.openxmlformats.org/markup-compatibility/2006" xmlns:aink="http://schemas.microsoft.com/office/drawing/2016/ink" xmlns:am3d="http://schemas.microsoft.com/office/drawing/2017/model3d" xmlns:o="urn:schemas-microsoft-com:office:office" xmlns:oel="http://schemas.microsoft.com/office/2019/extlst" xmlns:r="http://schemas.openxmlformats.org/officeDocument/2006/relationships" xmlns:m="http://schemas.openxmlformats.org/officeDocument/2006/math" xmlns:v="urn:schemas-microsoft-com:vml" xmlns:wp14="http://schemas.microsoft.com/office/word/2010/wordprocessingDrawing" xmlns:wp="http://schemas.openxmlformats.org/drawingml/2006/wordprocessingDrawing" xmlns:w10="urn:schemas-microsoft-com:office:word" xmlns:w="http://schemas.openxmlformats.org/wordprocessingml/2006/main" xmlns:w14="http://schemas.microsoft.com/office/word/2010/wordml" xmlns:w15="http://schemas.microsoft.com/office/word/2012/wordml" xmlns:w16cei="http://schemas.microsoft.com/office/word/2026/wordml/cei" xmlns:w16cex="http://schemas.microsoft.com/office/word/2018/wordml/cex" xmlns:w16cid="http://schemas.microsoft.com/office/word/2016/wordml/cid" xmlns:w16="http://schemas.microsoft.com/office/word/2018/wordml" xmlns:w16du="http://schemas.microsoft.com/office/word/2023/wordml/word16du" xmlns:w16sdtdh="http://schemas.microsoft.com/office/word/2020/wordml/sdtdatahash" xmlns:w16sdtfl="http://schemas.microsoft.com/office/word/2024/wordml/sdtformatlock" xmlns:w16se="http://schemas.microsoft.com/office/word/2015/wordml/symex" xmlns:wpg="http://schemas.microsoft.com/office/word/2010/wordprocessingGroup" xmlns:wpi="http://schemas.microsoft.com/office/word/2010/wordprocessingInk" xmlns:wne="http://schemas.microsoft.com/office/word/2006/wordml" xmlns:wps="http://schemas.microsoft.com/office/word/2010/wordprocessingShape" mc:Ignorable="w14 w15 w16se w16cid w16 w16cex w16sdtdh w16sdtfl w16du wp14">
   <w:abstractNum w:abstractNumId="0" w15:restartNumberingAfterBreak="0">
     <w:nsid w:val="258525F4"/>
     <w:multiLevelType w:val="hybridMultilevel"/>
@@ -663,12 +788,12 @@
 </file>
 
 <file path=word/styles.xml><?xml version="1.0" encoding="utf-8"?>
-<w:styles xmlns:mc="http://schemas.openxmlformats.org/markup-compatibility/2006" xmlns:r="http://schemas.openxmlformats.org/officeDocument/2006/relationships" xmlns:w="http://schemas.openxmlformats.org/wordprocessingml/2006/main" xmlns:w14="http://schemas.microsoft.com/office/word/2010/wordml" xmlns:w15="http://schemas.microsoft.com/office/word/2012/wordml" xmlns:w16cex="http://schemas.microsoft.com/office/word/2018/wordml/cex" xmlns:w16cid="http://schemas.microsoft.com/office/word/2016/wordml/cid" xmlns:w16="http://schemas.microsoft.com/office/word/2018/wordml" xmlns:w16sdtdh="http://schemas.microsoft.com/office/word/2020/wordml/sdtdatahash" xmlns:w16se="http://schemas.microsoft.com/office/word/2015/wordml/symex" mc:Ignorable="w14 w15 w16se w16cid w16 w16cex w16sdtdh">
+<w:styles xmlns:mc="http://schemas.openxmlformats.org/markup-compatibility/2006" xmlns:r="http://schemas.openxmlformats.org/officeDocument/2006/relationships" xmlns:w="http://schemas.openxmlformats.org/wordprocessingml/2006/main" xmlns:w14="http://schemas.microsoft.com/office/word/2010/wordml" xmlns:w15="http://schemas.microsoft.com/office/word/2012/wordml" xmlns:w16cex="http://schemas.microsoft.com/office/word/2018/wordml/cex" xmlns:w16cid="http://schemas.microsoft.com/office/word/2016/wordml/cid" xmlns:w16="http://schemas.microsoft.com/office/word/2018/wordml" xmlns:w16du="http://schemas.microsoft.com/office/word/2023/wordml/word16du" xmlns:w16sdtdh="http://schemas.microsoft.com/office/word/2020/wordml/sdtdatahash" xmlns:w16sdtfl="http://schemas.microsoft.com/office/word/2024/wordml/sdtformatlock" xmlns:w16se="http://schemas.microsoft.com/office/word/2015/wordml/symex" mc:Ignorable="w14 w15 w16se w16cid w16 w16cex w16sdtdh w16sdtfl w16du">
   <w:docDefaults>
     <w:rPrDefault>
       <w:rPr>
         <w:rFonts w:ascii="Times New Roman" w:eastAsia="Times New Roman" w:hAnsi="Times New Roman" w:cs="Times New Roman"/>
-        <w:lang w:val="en-VN" w:eastAsia="en-US" w:bidi="ar-SA"/>
+        <w:lang w:eastAsia="en-US" w:bidi="ar-SA"/>
       </w:rPr>
     </w:rPrDefault>
     <w:pPrDefault/>

</xml_diff>